<commit_message>
docs: Admin Guide privacy page; Overview updated for UK/Belgium and backups
Admin Guide gains a "Privacy and Data" section: what is collected, the
full data-lifetime table, the voice question, the r180 phone-copy fix,
UK GDPR with the Belgium (europe-west1) database location, Firebase
automated backups confirmed off on 17 Sep 2026, what the 216 MB Storage
figure is, the devotee-facing privacy line, and the known queue-access
weakness. Visitor Overview re-exported with the same updates.

Co-Authored-By: Claude Fable 5.1 <noreply@anthropic.com>
Claude-Session: https://claude.ai/code/session_011FrxDHAbJME8KYfFFCqK3z
</commit_message>
<xml_diff>
--- a/docs/GanapatiAI_Admin_Guide.docx
+++ b/docs/GanapatiAI_Admin_Guide.docx
@@ -2963,6 +2963,877 @@
         </w:tc>
       </w:tr>
     </w:tbl>
+    <w:p>
+      <w:r>
+        <w:br w:type="page"/>
+      </w:r>
+    </w:p>
+    <w:p>
+      <w:pPr>
+        <w:pStyle w:val="Heading1"/>
+      </w:pPr>
+      <w:r>
+        <w:t xml:space="preserve">Privacy and Data</w:t>
+      </w:r>
+    </w:p>
+    <w:p>
+      <w:r>
+        <w:rPr>
+          <w:color w:val="222222"/>
+          <w:sz w:val="20"/>
+          <w:szCs w:val="20"/>
+        </w:rPr>
+        <w:t xml:space="preserve">Short answer: a devotee's prayer exists for seconds in transit, minutes in the priest queue, and a limited retention window at the two AI providers under their standard terms. Nothing under the temple's control keeps it after the priest presents it. This is an engineer's reading of the system, not legal advice.</w:t>
+      </w:r>
+    </w:p>
+    <w:p>
+      <w:pPr>
+        <w:pStyle w:val="Heading2"/>
+      </w:pPr>
+      <w:r>
+        <w:t xml:space="preserve">What is collected</w:t>
+      </w:r>
+    </w:p>
+    <w:p>
+      <w:r>
+        <w:rPr>
+          <w:color w:val="222222"/>
+          <w:sz w:val="20"/>
+          <w:szCs w:val="20"/>
+        </w:rPr>
+        <w:t xml:space="preserve">A name (optional; blank becomes "Anonymous Devotee"), the prayer text (up to 20 words), the offering type, the reply language, an optional intent, and a submission time. No email, phone number, account, cookies or analytics. Because a prayer can reveal religion or health, the prayer text matters more than the name.</w:t>
+      </w:r>
+    </w:p>
+    <w:p>
+      <w:pPr>
+        <w:pStyle w:val="Heading2"/>
+      </w:pPr>
+      <w:r>
+        <w:t xml:space="preserve">Where each prayer goes and how long it stays</w:t>
+      </w:r>
+    </w:p>
+    <w:tbl>
+      <w:tblPr>
+        <w:tblW w:type="dxa" w:w="9000"/>
+        <w:tblBorders>
+          <w:top w:val="single" w:color="auto" w:sz="4"/>
+          <w:left w:val="single" w:color="auto" w:sz="4"/>
+          <w:bottom w:val="single" w:color="auto" w:sz="4"/>
+          <w:right w:val="single" w:color="auto" w:sz="4"/>
+          <w:insideH w:val="single" w:color="auto" w:sz="4"/>
+          <w:insideV w:val="single" w:color="auto" w:sz="4"/>
+        </w:tblBorders>
+      </w:tblPr>
+      <w:tblGrid>
+        <w:gridCol w:w="2200"/>
+        <w:gridCol w:w="3000"/>
+        <w:gridCol w:w="3800"/>
+      </w:tblGrid>
+      <w:tr>
+        <w:trPr>
+          <w:tblHeader/>
+        </w:trPr>
+        <w:tc>
+          <w:tcPr>
+            <w:tcW w:type="dxa" w:w="2200"/>
+            <w:shd w:fill="EFE6C8" w:color="auto" w:val="clear"/>
+            <w:tcMar>
+              <w:top w:type="dxa" w:w="100"/>
+              <w:left w:type="dxa" w:w="120"/>
+              <w:bottom w:type="dxa" w:w="100"/>
+              <w:right w:type="dxa" w:w="120"/>
+            </w:tcMar>
+            <w:vAlign w:val="center"/>
+          </w:tcPr>
+          <w:p>
+            <w:r>
+              <w:rPr>
+                <w:b/>
+                <w:bCs/>
+                <w:color w:val="5C4A0E"/>
+                <w:sz w:val="20"/>
+                <w:szCs w:val="20"/>
+              </w:rPr>
+              <w:t xml:space="preserve">Place</w:t>
+            </w:r>
+          </w:p>
+        </w:tc>
+        <w:tc>
+          <w:tcPr>
+            <w:tcW w:type="dxa" w:w="3000"/>
+            <w:shd w:fill="EFE6C8" w:color="auto" w:val="clear"/>
+            <w:tcMar>
+              <w:top w:type="dxa" w:w="100"/>
+              <w:left w:type="dxa" w:w="120"/>
+              <w:bottom w:type="dxa" w:w="100"/>
+              <w:right w:type="dxa" w:w="120"/>
+            </w:tcMar>
+            <w:vAlign w:val="center"/>
+          </w:tcPr>
+          <w:p>
+            <w:r>
+              <w:rPr>
+                <w:b/>
+                <w:bCs/>
+                <w:color w:val="5C4A0E"/>
+                <w:sz w:val="20"/>
+                <w:szCs w:val="20"/>
+              </w:rPr>
+              <w:t xml:space="preserve">What it receives</w:t>
+            </w:r>
+          </w:p>
+        </w:tc>
+        <w:tc>
+          <w:tcPr>
+            <w:tcW w:type="dxa" w:w="3800"/>
+            <w:shd w:fill="EFE6C8" w:color="auto" w:val="clear"/>
+            <w:tcMar>
+              <w:top w:type="dxa" w:w="100"/>
+              <w:left w:type="dxa" w:w="120"/>
+              <w:bottom w:type="dxa" w:w="100"/>
+              <w:right w:type="dxa" w:w="120"/>
+            </w:tcMar>
+            <w:vAlign w:val="center"/>
+          </w:tcPr>
+          <w:p>
+            <w:r>
+              <w:rPr>
+                <w:b/>
+                <w:bCs/>
+                <w:color w:val="5C4A0E"/>
+                <w:sz w:val="20"/>
+                <w:szCs w:val="20"/>
+              </w:rPr>
+              <w:t xml:space="preserve">How long it stays</w:t>
+            </w:r>
+          </w:p>
+        </w:tc>
+      </w:tr>
+      <w:tr>
+        <w:tc>
+          <w:tcPr>
+            <w:tcW w:type="dxa" w:w="2200"/>
+            <w:shd w:fill="FAF8F0" w:color="auto" w:val="clear"/>
+            <w:tcMar>
+              <w:top w:type="dxa" w:w="100"/>
+              <w:left w:type="dxa" w:w="120"/>
+              <w:bottom w:type="dxa" w:w="100"/>
+              <w:right w:type="dxa" w:w="120"/>
+            </w:tcMar>
+            <w:vAlign w:val="center"/>
+          </w:tcPr>
+          <w:p>
+            <w:r>
+              <w:rPr>
+                <w:b w:val="false"/>
+                <w:bCs w:val="false"/>
+                <w:color w:val="222222"/>
+                <w:sz w:val="20"/>
+                <w:szCs w:val="20"/>
+              </w:rPr>
+              <w:t xml:space="preserve">Devotee's phone</w:t>
+            </w:r>
+          </w:p>
+        </w:tc>
+        <w:tc>
+          <w:tcPr>
+            <w:tcW w:type="dxa" w:w="3000"/>
+            <w:shd w:fill="FAF8F0" w:color="auto" w:val="clear"/>
+            <w:tcMar>
+              <w:top w:type="dxa" w:w="100"/>
+              <w:left w:type="dxa" w:w="120"/>
+              <w:bottom w:type="dxa" w:w="100"/>
+              <w:right w:type="dxa" w:w="120"/>
+            </w:tcMar>
+            <w:vAlign w:val="center"/>
+          </w:tcPr>
+          <w:p>
+            <w:r>
+              <w:rPr>
+                <w:b w:val="false"/>
+                <w:bCs w:val="false"/>
+                <w:color w:val="222222"/>
+                <w:sz w:val="20"/>
+                <w:szCs w:val="20"/>
+              </w:rPr>
+              <w:t xml:space="preserve">The form as typed</w:t>
+            </w:r>
+          </w:p>
+        </w:tc>
+        <w:tc>
+          <w:tcPr>
+            <w:tcW w:type="dxa" w:w="3800"/>
+            <w:shd w:fill="FAF8F0" w:color="auto" w:val="clear"/>
+            <w:tcMar>
+              <w:top w:type="dxa" w:w="100"/>
+              <w:left w:type="dxa" w:w="120"/>
+              <w:bottom w:type="dxa" w:w="100"/>
+              <w:right w:type="dxa" w:w="120"/>
+            </w:tcMar>
+            <w:vAlign w:val="center"/>
+          </w:tcPr>
+          <w:p>
+            <w:r>
+              <w:rPr>
+                <w:b w:val="false"/>
+                <w:bCs w:val="false"/>
+                <w:color w:val="222222"/>
+                <w:sz w:val="20"/>
+                <w:szCs w:val="20"/>
+              </w:rPr>
+              <w:t xml:space="preserve">Nothing since r180. Earlier versions left a hidden copy in the browser's storage; r180 removes it on the next visit.</w:t>
+            </w:r>
+          </w:p>
+        </w:tc>
+      </w:tr>
+      <w:tr>
+        <w:tc>
+          <w:tcPr>
+            <w:tcW w:type="dxa" w:w="2200"/>
+            <w:shd w:fill="FAF8F0" w:color="auto" w:val="clear"/>
+            <w:tcMar>
+              <w:top w:type="dxa" w:w="100"/>
+              <w:left w:type="dxa" w:w="120"/>
+              <w:bottom w:type="dxa" w:w="100"/>
+              <w:right w:type="dxa" w:w="120"/>
+            </w:tcMar>
+            <w:vAlign w:val="center"/>
+          </w:tcPr>
+          <w:p>
+            <w:r>
+              <w:rPr>
+                <w:b w:val="false"/>
+                <w:bCs w:val="false"/>
+                <w:color w:val="222222"/>
+                <w:sz w:val="20"/>
+                <w:szCs w:val="20"/>
+              </w:rPr>
+              <w:t xml:space="preserve">Speech-to-text (Google, via the phone's browser)</w:t>
+            </w:r>
+          </w:p>
+        </w:tc>
+        <w:tc>
+          <w:tcPr>
+            <w:tcW w:type="dxa" w:w="3000"/>
+            <w:shd w:fill="FAF8F0" w:color="auto" w:val="clear"/>
+            <w:tcMar>
+              <w:top w:type="dxa" w:w="100"/>
+              <w:left w:type="dxa" w:w="120"/>
+              <w:bottom w:type="dxa" w:w="100"/>
+              <w:right w:type="dxa" w:w="120"/>
+            </w:tcMar>
+            <w:vAlign w:val="center"/>
+          </w:tcPr>
+          <w:p>
+            <w:r>
+              <w:rPr>
+                <w:b w:val="false"/>
+                <w:bCs w:val="false"/>
+                <w:color w:val="222222"/>
+                <w:sz w:val="20"/>
+                <w:szCs w:val="20"/>
+              </w:rPr>
+              <w:t xml:space="preserve">The devotee's voice, only if the mic is used</w:t>
+            </w:r>
+          </w:p>
+        </w:tc>
+        <w:tc>
+          <w:tcPr>
+            <w:tcW w:type="dxa" w:w="3800"/>
+            <w:shd w:fill="FAF8F0" w:color="auto" w:val="clear"/>
+            <w:tcMar>
+              <w:top w:type="dxa" w:w="100"/>
+              <w:left w:type="dxa" w:w="120"/>
+              <w:bottom w:type="dxa" w:w="100"/>
+              <w:right w:type="dxa" w:w="120"/>
+            </w:tcMar>
+            <w:vAlign w:val="center"/>
+          </w:tcPr>
+          <w:p>
+            <w:r>
+              <w:rPr>
+                <w:b w:val="false"/>
+                <w:bCs w:val="false"/>
+                <w:color w:val="222222"/>
+                <w:sz w:val="20"/>
+                <w:szCs w:val="20"/>
+              </w:rPr>
+              <w:t xml:space="preserve">Handled between the phone and Google under Google's terms. Only text comes back; no audio ever reaches this system.</w:t>
+            </w:r>
+          </w:p>
+        </w:tc>
+      </w:tr>
+      <w:tr>
+        <w:tc>
+          <w:tcPr>
+            <w:tcW w:type="dxa" w:w="2200"/>
+            <w:shd w:fill="FAF8F0" w:color="auto" w:val="clear"/>
+            <w:tcMar>
+              <w:top w:type="dxa" w:w="100"/>
+              <w:left w:type="dxa" w:w="120"/>
+              <w:bottom w:type="dxa" w:w="100"/>
+              <w:right w:type="dxa" w:w="120"/>
+            </w:tcMar>
+            <w:vAlign w:val="center"/>
+          </w:tcPr>
+          <w:p>
+            <w:r>
+              <w:rPr>
+                <w:b w:val="false"/>
+                <w:bCs w:val="false"/>
+                <w:color w:val="222222"/>
+                <w:sz w:val="20"/>
+                <w:szCs w:val="20"/>
+              </w:rPr>
+              <w:t xml:space="preserve">Firebase Realtime Database queue (EU, Belgium)</w:t>
+            </w:r>
+          </w:p>
+        </w:tc>
+        <w:tc>
+          <w:tcPr>
+            <w:tcW w:type="dxa" w:w="3000"/>
+            <w:shd w:fill="FAF8F0" w:color="auto" w:val="clear"/>
+            <w:tcMar>
+              <w:top w:type="dxa" w:w="100"/>
+              <w:left w:type="dxa" w:w="120"/>
+              <w:bottom w:type="dxa" w:w="100"/>
+              <w:right w:type="dxa" w:w="120"/>
+            </w:tcMar>
+            <w:vAlign w:val="center"/>
+          </w:tcPr>
+          <w:p>
+            <w:r>
+              <w:rPr>
+                <w:b w:val="false"/>
+                <w:bCs w:val="false"/>
+                <w:color w:val="222222"/>
+                <w:sz w:val="20"/>
+                <w:szCs w:val="20"/>
+              </w:rPr>
+              <w:t xml:space="preserve">Name, offering, prayer, language, intent, then the finished blessing</w:t>
+            </w:r>
+          </w:p>
+        </w:tc>
+        <w:tc>
+          <w:tcPr>
+            <w:tcW w:type="dxa" w:w="3800"/>
+            <w:shd w:fill="FAF8F0" w:color="auto" w:val="clear"/>
+            <w:tcMar>
+              <w:top w:type="dxa" w:w="100"/>
+              <w:left w:type="dxa" w:w="120"/>
+              <w:bottom w:type="dxa" w:w="100"/>
+              <w:right w:type="dxa" w:w="120"/>
+            </w:tcMar>
+            <w:vAlign w:val="center"/>
+          </w:tcPr>
+          <w:p>
+            <w:r>
+              <w:rPr>
+                <w:b w:val="false"/>
+                <w:bCs w:val="false"/>
+                <w:color w:val="222222"/>
+                <w:sz w:val="20"/>
+                <w:szCs w:val="20"/>
+              </w:rPr>
+              <w:t xml:space="preserve">Minutes: deleted the moment the priest taps Approve or Reject. No archive or history exists.</w:t>
+            </w:r>
+          </w:p>
+        </w:tc>
+      </w:tr>
+      <w:tr>
+        <w:tc>
+          <w:tcPr>
+            <w:tcW w:type="dxa" w:w="2200"/>
+            <w:shd w:fill="FAF8F0" w:color="auto" w:val="clear"/>
+            <w:tcMar>
+              <w:top w:type="dxa" w:w="100"/>
+              <w:left w:type="dxa" w:w="120"/>
+              <w:bottom w:type="dxa" w:w="100"/>
+              <w:right w:type="dxa" w:w="120"/>
+            </w:tcMar>
+            <w:vAlign w:val="center"/>
+          </w:tcPr>
+          <w:p>
+            <w:r>
+              <w:rPr>
+                <w:b w:val="false"/>
+                <w:bCs w:val="false"/>
+                <w:color w:val="222222"/>
+                <w:sz w:val="20"/>
+                <w:szCs w:val="20"/>
+              </w:rPr>
+              <w:t xml:space="preserve">Cloud Function generateBlessing (US)</w:t>
+            </w:r>
+          </w:p>
+        </w:tc>
+        <w:tc>
+          <w:tcPr>
+            <w:tcW w:type="dxa" w:w="3000"/>
+            <w:shd w:fill="FAF8F0" w:color="auto" w:val="clear"/>
+            <w:tcMar>
+              <w:top w:type="dxa" w:w="100"/>
+              <w:left w:type="dxa" w:w="120"/>
+              <w:bottom w:type="dxa" w:w="100"/>
+              <w:right w:type="dxa" w:w="120"/>
+            </w:tcMar>
+            <w:vAlign w:val="center"/>
+          </w:tcPr>
+          <w:p>
+            <w:r>
+              <w:rPr>
+                <w:b w:val="false"/>
+                <w:bCs w:val="false"/>
+                <w:color w:val="222222"/>
+                <w:sz w:val="20"/>
+                <w:szCs w:val="20"/>
+              </w:rPr>
+              <w:t xml:space="preserve">Name, prayer, offering, intent</w:t>
+            </w:r>
+          </w:p>
+        </w:tc>
+        <w:tc>
+          <w:tcPr>
+            <w:tcW w:type="dxa" w:w="3800"/>
+            <w:shd w:fill="FAF8F0" w:color="auto" w:val="clear"/>
+            <w:tcMar>
+              <w:top w:type="dxa" w:w="100"/>
+              <w:left w:type="dxa" w:w="120"/>
+              <w:bottom w:type="dxa" w:w="100"/>
+              <w:right w:type="dxa" w:w="120"/>
+            </w:tcMar>
+            <w:vAlign w:val="center"/>
+          </w:tcPr>
+          <w:p>
+            <w:r>
+              <w:rPr>
+                <w:b w:val="false"/>
+                <w:bCs w:val="false"/>
+                <w:color w:val="222222"/>
+                <w:sz w:val="20"/>
+                <w:szCs w:val="20"/>
+              </w:rPr>
+              <w:t xml:space="preserve">Memory only while it runs. Google keeps invocation logs about 30 days; our one log line per blessing holds the first few words of Claude's reply, never the prayer.</w:t>
+            </w:r>
+          </w:p>
+        </w:tc>
+      </w:tr>
+      <w:tr>
+        <w:tc>
+          <w:tcPr>
+            <w:tcW w:type="dxa" w:w="2200"/>
+            <w:shd w:fill="FAF8F0" w:color="auto" w:val="clear"/>
+            <w:tcMar>
+              <w:top w:type="dxa" w:w="100"/>
+              <w:left w:type="dxa" w:w="120"/>
+              <w:bottom w:type="dxa" w:w="100"/>
+              <w:right w:type="dxa" w:w="120"/>
+            </w:tcMar>
+            <w:vAlign w:val="center"/>
+          </w:tcPr>
+          <w:p>
+            <w:r>
+              <w:rPr>
+                <w:b w:val="false"/>
+                <w:bCs w:val="false"/>
+                <w:color w:val="222222"/>
+                <w:sz w:val="20"/>
+                <w:szCs w:val="20"/>
+              </w:rPr>
+              <w:t xml:space="preserve">Anthropic API (Claude)</w:t>
+            </w:r>
+          </w:p>
+        </w:tc>
+        <w:tc>
+          <w:tcPr>
+            <w:tcW w:type="dxa" w:w="3000"/>
+            <w:shd w:fill="FAF8F0" w:color="auto" w:val="clear"/>
+            <w:tcMar>
+              <w:top w:type="dxa" w:w="100"/>
+              <w:left w:type="dxa" w:w="120"/>
+              <w:bottom w:type="dxa" w:w="100"/>
+              <w:right w:type="dxa" w:w="120"/>
+            </w:tcMar>
+            <w:vAlign w:val="center"/>
+          </w:tcPr>
+          <w:p>
+            <w:r>
+              <w:rPr>
+                <w:b w:val="false"/>
+                <w:bCs w:val="false"/>
+                <w:color w:val="222222"/>
+                <w:sz w:val="20"/>
+                <w:szCs w:val="20"/>
+              </w:rPr>
+              <w:t xml:space="preserve">Name and prayer inside the prompt</w:t>
+            </w:r>
+          </w:p>
+        </w:tc>
+        <w:tc>
+          <w:tcPr>
+            <w:tcW w:type="dxa" w:w="3800"/>
+            <w:shd w:fill="FAF8F0" w:color="auto" w:val="clear"/>
+            <w:tcMar>
+              <w:top w:type="dxa" w:w="100"/>
+              <w:left w:type="dxa" w:w="120"/>
+              <w:bottom w:type="dxa" w:w="100"/>
+              <w:right w:type="dxa" w:w="120"/>
+            </w:tcMar>
+            <w:vAlign w:val="center"/>
+          </w:tcPr>
+          <w:p>
+            <w:r>
+              <w:rPr>
+                <w:b w:val="false"/>
+                <w:bCs w:val="false"/>
+                <w:color w:val="222222"/>
+                <w:sz w:val="20"/>
+                <w:szCs w:val="20"/>
+              </w:rPr>
+              <w:t xml:space="preserve">Not used for training under the API terms; kept for a limited period for abuse monitoring, then deleted.</w:t>
+            </w:r>
+          </w:p>
+        </w:tc>
+      </w:tr>
+      <w:tr>
+        <w:tc>
+          <w:tcPr>
+            <w:tcW w:type="dxa" w:w="2200"/>
+            <w:shd w:fill="FAF8F0" w:color="auto" w:val="clear"/>
+            <w:tcMar>
+              <w:top w:type="dxa" w:w="100"/>
+              <w:left w:type="dxa" w:w="120"/>
+              <w:bottom w:type="dxa" w:w="100"/>
+              <w:right w:type="dxa" w:w="120"/>
+            </w:tcMar>
+            <w:vAlign w:val="center"/>
+          </w:tcPr>
+          <w:p>
+            <w:r>
+              <w:rPr>
+                <w:b w:val="false"/>
+                <w:bCs w:val="false"/>
+                <w:color w:val="222222"/>
+                <w:sz w:val="20"/>
+                <w:szCs w:val="20"/>
+              </w:rPr>
+              <w:t xml:space="preserve">Google Text-to-Speech</w:t>
+            </w:r>
+          </w:p>
+        </w:tc>
+        <w:tc>
+          <w:tcPr>
+            <w:tcW w:type="dxa" w:w="3000"/>
+            <w:shd w:fill="FAF8F0" w:color="auto" w:val="clear"/>
+            <w:tcMar>
+              <w:top w:type="dxa" w:w="100"/>
+              <w:left w:type="dxa" w:w="120"/>
+              <w:bottom w:type="dxa" w:w="100"/>
+              <w:right w:type="dxa" w:w="120"/>
+            </w:tcMar>
+            <w:vAlign w:val="center"/>
+          </w:tcPr>
+          <w:p>
+            <w:r>
+              <w:rPr>
+                <w:b w:val="false"/>
+                <w:bCs w:val="false"/>
+                <w:color w:val="222222"/>
+                <w:sz w:val="20"/>
+                <w:szCs w:val="20"/>
+              </w:rPr>
+              <w:t xml:space="preserve">The finished blessing text only, never the prayer</w:t>
+            </w:r>
+          </w:p>
+        </w:tc>
+        <w:tc>
+          <w:tcPr>
+            <w:tcW w:type="dxa" w:w="3800"/>
+            <w:shd w:fill="FAF8F0" w:color="auto" w:val="clear"/>
+            <w:tcMar>
+              <w:top w:type="dxa" w:w="100"/>
+              <w:left w:type="dxa" w:w="120"/>
+              <w:bottom w:type="dxa" w:w="100"/>
+              <w:right w:type="dxa" w:w="120"/>
+            </w:tcMar>
+            <w:vAlign w:val="center"/>
+          </w:tcPr>
+          <w:p>
+            <w:r>
+              <w:rPr>
+                <w:b w:val="false"/>
+                <w:bCs w:val="false"/>
+                <w:color w:val="222222"/>
+                <w:sz w:val="20"/>
+                <w:szCs w:val="20"/>
+              </w:rPr>
+              <w:t xml:space="preserve">Converted to audio per request; not stored as a product feature.</w:t>
+            </w:r>
+          </w:p>
+        </w:tc>
+      </w:tr>
+      <w:tr>
+        <w:tc>
+          <w:tcPr>
+            <w:tcW w:type="dxa" w:w="2200"/>
+            <w:shd w:fill="FAF8F0" w:color="auto" w:val="clear"/>
+            <w:tcMar>
+              <w:top w:type="dxa" w:w="100"/>
+              <w:left w:type="dxa" w:w="120"/>
+              <w:bottom w:type="dxa" w:w="100"/>
+              <w:right w:type="dxa" w:w="120"/>
+            </w:tcMar>
+            <w:vAlign w:val="center"/>
+          </w:tcPr>
+          <w:p>
+            <w:r>
+              <w:rPr>
+                <w:b w:val="false"/>
+                <w:bCs w:val="false"/>
+                <w:color w:val="222222"/>
+                <w:sz w:val="20"/>
+                <w:szCs w:val="20"/>
+              </w:rPr>
+              <w:t xml:space="preserve">Script renderer (renderTextImage)</w:t>
+            </w:r>
+          </w:p>
+        </w:tc>
+        <w:tc>
+          <w:tcPr>
+            <w:tcW w:type="dxa" w:w="3000"/>
+            <w:shd w:fill="FAF8F0" w:color="auto" w:val="clear"/>
+            <w:tcMar>
+              <w:top w:type="dxa" w:w="100"/>
+              <w:left w:type="dxa" w:w="120"/>
+              <w:bottom w:type="dxa" w:w="100"/>
+              <w:right w:type="dxa" w:w="120"/>
+            </w:tcMar>
+            <w:vAlign w:val="center"/>
+          </w:tcPr>
+          <w:p>
+            <w:r>
+              <w:rPr>
+                <w:b w:val="false"/>
+                <w:bCs w:val="false"/>
+                <w:color w:val="222222"/>
+                <w:sz w:val="20"/>
+                <w:szCs w:val="20"/>
+              </w:rPr>
+              <w:t xml:space="preserve">The finished blessing text only</w:t>
+            </w:r>
+          </w:p>
+        </w:tc>
+        <w:tc>
+          <w:tcPr>
+            <w:tcW w:type="dxa" w:w="3800"/>
+            <w:shd w:fill="FAF8F0" w:color="auto" w:val="clear"/>
+            <w:tcMar>
+              <w:top w:type="dxa" w:w="100"/>
+              <w:left w:type="dxa" w:w="120"/>
+              <w:bottom w:type="dxa" w:w="100"/>
+              <w:right w:type="dxa" w:w="120"/>
+            </w:tcMar>
+            <w:vAlign w:val="center"/>
+          </w:tcPr>
+          <w:p>
+            <w:r>
+              <w:rPr>
+                <w:b w:val="false"/>
+                <w:bCs w:val="false"/>
+                <w:color w:val="222222"/>
+                <w:sz w:val="20"/>
+                <w:szCs w:val="20"/>
+              </w:rPr>
+              <w:t xml:space="preserve">Memory only while it draws the screen bitmap.</w:t>
+            </w:r>
+          </w:p>
+        </w:tc>
+      </w:tr>
+      <w:tr>
+        <w:tc>
+          <w:tcPr>
+            <w:tcW w:type="dxa" w:w="2200"/>
+            <w:shd w:fill="FAF8F0" w:color="auto" w:val="clear"/>
+            <w:tcMar>
+              <w:top w:type="dxa" w:w="100"/>
+              <w:left w:type="dxa" w:w="120"/>
+              <w:bottom w:type="dxa" w:w="100"/>
+              <w:right w:type="dxa" w:w="120"/>
+            </w:tcMar>
+            <w:vAlign w:val="center"/>
+          </w:tcPr>
+          <w:p>
+            <w:r>
+              <w:rPr>
+                <w:b w:val="false"/>
+                <w:bCs w:val="false"/>
+                <w:color w:val="222222"/>
+                <w:sz w:val="20"/>
+                <w:szCs w:val="20"/>
+              </w:rPr>
+              <w:t xml:space="preserve">The altar</w:t>
+            </w:r>
+          </w:p>
+        </w:tc>
+        <w:tc>
+          <w:tcPr>
+            <w:tcW w:type="dxa" w:w="3000"/>
+            <w:shd w:fill="FAF8F0" w:color="auto" w:val="clear"/>
+            <w:tcMar>
+              <w:top w:type="dxa" w:w="100"/>
+              <w:left w:type="dxa" w:w="120"/>
+              <w:bottom w:type="dxa" w:w="100"/>
+              <w:right w:type="dxa" w:w="120"/>
+            </w:tcMar>
+            <w:vAlign w:val="center"/>
+          </w:tcPr>
+          <w:p>
+            <w:r>
+              <w:rPr>
+                <w:b w:val="false"/>
+                <w:bCs w:val="false"/>
+                <w:color w:val="222222"/>
+                <w:sz w:val="20"/>
+                <w:szCs w:val="20"/>
+              </w:rPr>
+              <w:t xml:space="preserve">Name, offering, blessing text, mood</w:t>
+            </w:r>
+          </w:p>
+        </w:tc>
+        <w:tc>
+          <w:tcPr>
+            <w:tcW w:type="dxa" w:w="3800"/>
+            <w:shd w:fill="FAF8F0" w:color="auto" w:val="clear"/>
+            <w:tcMar>
+              <w:top w:type="dxa" w:w="100"/>
+              <w:left w:type="dxa" w:w="120"/>
+              <w:bottom w:type="dxa" w:w="100"/>
+              <w:right w:type="dxa" w:w="120"/>
+            </w:tcMar>
+            <w:vAlign w:val="center"/>
+          </w:tcPr>
+          <w:p>
+            <w:r>
+              <w:rPr>
+                <w:b w:val="false"/>
+                <w:bCs w:val="false"/>
+                <w:color w:val="222222"/>
+                <w:sz w:val="20"/>
+                <w:szCs w:val="20"/>
+              </w:rPr>
+              <w:t xml:space="preserve">Shown once on screen and spoken; gone at the next state change.</w:t>
+            </w:r>
+          </w:p>
+        </w:tc>
+      </w:tr>
+    </w:tbl>
+    <w:p>
+      <w:pPr>
+        <w:pStyle w:val="Heading2"/>
+      </w:pPr>
+      <w:r>
+        <w:t xml:space="preserve">Is the devotee's voice recorded?</w:t>
+      </w:r>
+    </w:p>
+    <w:p>
+      <w:r>
+        <w:rPr>
+          <w:color w:val="222222"/>
+          <w:sz w:val="20"/>
+          <w:szCs w:val="20"/>
+        </w:rPr>
+        <w:t xml:space="preserve">No. The altar receives text only, never audio. Its own microphone input is reserved in the wiring plan but connected to nothing and read by no code. When a devotee taps the mic on the puja page, the phone's browser does the listening; on Android and Chrome that is Google's speech service, under Google's terms, and only the text reaches this system. Nothing in GanapatiAI keeps, uploads or forwards a voice recording, so there is no sample anywhere that could be used to imitate anyone. The only voice in the system is Google's synthetic one for Ganesha.</w:t>
+      </w:r>
+    </w:p>
+    <w:p>
+      <w:pPr>
+        <w:pStyle w:val="Heading2"/>
+      </w:pPr>
+      <w:r>
+        <w:t xml:space="preserve">The phone copy, fixed in r180</w:t>
+      </w:r>
+    </w:p>
+    <w:p>
+      <w:r>
+        <w:rPr>
+          <w:color w:val="222222"/>
+          <w:sz w:val="20"/>
+          <w:szCs w:val="20"/>
+        </w:rPr>
+        <w:t xml:space="preserve">Before r180, pressing Send did two things: it sent the offering to the Firebase queue, and it also appended the same offering to the phone browser's own storage, a leftover from early testing when the puja page and the dashboard ran on the same device. The dashboard clears that storage on the priest's device when an item is approved, but the puja page never cleared it on the devotee's phone, so every prayer typed on a phone stayed in that browser indefinitely, invisible but present. On a shared phone at the altar this would have accumulated every devotee's prayer, and a dashboard opened on that same phone would have merged the stale items back in as pending. r180 removed the local write entirely and wipes whatever earlier versions left on the next visit. The audio preview, when a devotee ticks "hear it on my phone", plays from memory and is not saved.</w:t>
+      </w:r>
+    </w:p>
+    <w:p>
+      <w:pPr>
+        <w:pStyle w:val="Heading2"/>
+      </w:pPr>
+      <w:r>
+        <w:t xml:space="preserve">Hosting location and UK GDPR</w:t>
+      </w:r>
+    </w:p>
+    <w:p>
+      <w:r>
+        <w:rPr>
+          <w:color w:val="222222"/>
+          <w:sz w:val="20"/>
+          <w:szCs w:val="20"/>
+        </w:rPr>
+        <w:t xml:space="preserve">The temple, the priest and the queue are operated from the UK, so UK GDPR applies. The Firebase database itself is physically in Belgium (Google's europe-west1 region), which the console shows as "Database location: Belgium". That is a transfer from the UK to the EU, and the UK treats the EU and EEA as adequate, so no extra safeguard is needed; it is the best available position short of a UK-only region, which Firebase Realtime Database does not offer. The Cloud Functions run in the US (us-central1) and the Anthropic API is US-based; both rely on the providers' standard data-processing terms, the normal position for any UK site using Google Cloud or an AI API. If a stricter posture is ever wanted, the functions can be redeployed to London (europe-west2), which changes their URLs and so needs a matching puja page, dashboard and firmware update; a post-festival job.</w:t>
+      </w:r>
+    </w:p>
+    <w:p>
+      <w:pPr>
+        <w:pStyle w:val="Heading2"/>
+      </w:pPr>
+      <w:r>
+        <w:t xml:space="preserve">Firebase automated backups</w:t>
+      </w:r>
+    </w:p>
+    <w:p>
+      <w:r>
+        <w:rPr>
+          <w:color w:val="222222"/>
+          <w:sz w:val="20"/>
+          <w:szCs w:val="20"/>
+        </w:rPr>
+        <w:t xml:space="preserve">Confirmed off on 17 September 2026: the Backups tab for ganapatiai-default-rtdb shows only the "Get started" set-up card and no backup list, and the database's own storage reads 0 B when the queue is empty. To re-check at any time: Firebase console, project GanapatiAI, Build, Realtime Database, Backups tab. Enabled backups would show a schedule and dated backup files instead. Note that the separate "Storage" card on the project overview (about 216 MB, flat all week) is Cloud Storage, not the database; it holds the Cloud Functions deployment bundles (code, fonts and the script-rendering library), not devotee data. Build, Storage, Files shows its contents if anyone wants to confirm.</w:t>
+      </w:r>
+    </w:p>
+    <w:p>
+      <w:pPr>
+        <w:pStyle w:val="Heading2"/>
+      </w:pPr>
+      <w:r>
+        <w:t xml:space="preserve">The privacy line devotees see</w:t>
+      </w:r>
+    </w:p>
+    <w:p>
+      <w:r>
+        <w:rPr>
+          <w:color w:val="222222"/>
+          <w:sz w:val="20"/>
+          <w:szCs w:val="20"/>
+        </w:rPr>
+        <w:t xml:space="preserve">From r179 the puja page shows this directly above the Send button: "Your prayer is used only to present your offering to Bappa and to write your blessing. The priest offers it to Bappa and nothing more. Once offered, it is removed from the queue and is not kept by us." It says "not kept by us" rather than "not stored anywhere" because Google holds function logs for about a month and the AI providers have their own short retention, neither of which the temple controls.</w:t>
+      </w:r>
+    </w:p>
+    <w:p>
+      <w:pPr>
+        <w:pStyle w:val="Heading2"/>
+      </w:pPr>
+      <w:r>
+        <w:t xml:space="preserve">Known weakness and the post-festival fix</w:t>
+      </w:r>
+    </w:p>
+    <w:p>
+      <w:r>
+        <w:rPr>
+          <w:color w:val="222222"/>
+          <w:sz w:val="20"/>
+          <w:szCs w:val="20"/>
+        </w:rPr>
+        <w:t xml:space="preserve">The queue is readable and writable by anyone who knows its URL, with no login. This was a deliberate simplicity choice so phones, the dashboard and the altar could all reach it without accounts. In practice nobody has the URL but the priest, and items live only minutes, but it is the point a privacy-minded visitor would rightly raise. The fix is Firebase security rules plus anonymous sign-in, or a small Cloud Function in front of the queue. Until then: never publish the queue link, keep the name optional, and keep approving promptly so the queue stays short.</w:t>
+      </w:r>
+    </w:p>
     <w:sectPr>
       <w:pgSz w:w="11906" w:h="16838" w:orient="portrait"/>
       <w:pgMar w:top="1440" w:right="1440" w:bottom="1440" w:left="1440" w:header="708" w:footer="708" w:gutter="0"/>

</xml_diff>